<commit_message>
Gutschrift-Vorlage: Rechnungsbezug und Abgrenzungshinweis ergänzt
</commit_message>
<xml_diff>
--- a/public/downloads/gutschrift.docx
+++ b/public/downloads/gutschrift.docx
@@ -470,21 +470,7 @@
               <w:rPr>
                 <w:rFonts w:ascii="Arial" w:hAnsi="Arial" w:cs="Arial"/>
               </w:rPr>
-              <w:t xml:space="preserve">Ihre </w:t>
-            </w:r>
-            <w:proofErr w:type="spellStart"/>
-            <w:r>
-              <w:rPr>
-                <w:rFonts w:ascii="Arial" w:hAnsi="Arial" w:cs="Arial"/>
-              </w:rPr>
-              <w:t>UmSt</w:t>
-            </w:r>
-            <w:proofErr w:type="spellEnd"/>
-            <w:r>
-              <w:rPr>
-                <w:rFonts w:ascii="Arial" w:hAnsi="Arial" w:cs="Arial"/>
-              </w:rPr>
-              <w:t xml:space="preserve">. </w:t>
+              <w:t xml:space="preserve">Ihre UmSt. </w:t>
             </w:r>
             <w:r>
               <w:rPr>
@@ -520,23 +506,13 @@
                 <w:szCs w:val="16"/>
               </w:rPr>
             </w:pPr>
-            <w:proofErr w:type="spellStart"/>
             <w:r>
               <w:rPr>
                 <w:rFonts w:ascii="Arial" w:hAnsi="Arial" w:cs="Arial"/>
                 <w:sz w:val="16"/>
                 <w:szCs w:val="16"/>
               </w:rPr>
-              <w:t>Gutschriftssdatum</w:t>
-            </w:r>
-            <w:proofErr w:type="spellEnd"/>
-            <w:r>
-              <w:rPr>
-                <w:rFonts w:ascii="Arial" w:hAnsi="Arial" w:cs="Arial"/>
-                <w:sz w:val="16"/>
-                <w:szCs w:val="16"/>
-              </w:rPr>
-              <w:t xml:space="preserve"> entspricht Liefer</w:t>
+              <w:t>Gutschriftssdatum entspricht Liefer</w:t>
             </w:r>
             <w:r>
               <w:rPr>
@@ -701,10 +677,16 @@
               <w:rPr>
                 <w:rFonts w:ascii="Arial" w:hAnsi="Arial" w:cs="Arial"/>
               </w:rPr>
-              <w:t>gemäß unserer Vereinbarung schreiben wir Ihnen folgende Leistungen gut:</w:t>
-            </w:r>
-            <w:r>
-              <w:t xml:space="preserve">  </w:t>
+              <w:t>b</w:t>
+            </w:r>
+            <w:r>
+              <w:rPr>
+                <w:rFonts w:ascii="Arial" w:hAnsi="Arial" w:cs="Arial"/>
+              </w:rPr>
+              <w:t>ezugnehmend auf unsere Rechnung Nr. [Nummer] vom [Datum] schreiben wir Ihnen folgende Leistungen gut:</w:t>
+            </w:r>
+            <w:r>
+              <w:t xml:space="preserve"> </w:t>
             </w:r>
           </w:p>
         </w:tc>
@@ -1434,6 +1416,38 @@
               <w:t>Wir überweisen Ihnen den Gutschriftsbetrag in den nächsten Tagen auf Ihr Konto.</w:t>
             </w:r>
           </w:p>
+          <w:p>
+            <w:pPr>
+              <w:rPr>
+                <w:rFonts w:ascii="Arial" w:hAnsi="Arial" w:cs="Arial"/>
+              </w:rPr>
+            </w:pPr>
+          </w:p>
+          <w:p>
+            <w:pPr>
+              <w:rPr>
+                <w:rFonts w:ascii="Arial" w:hAnsi="Arial" w:cs="Arial"/>
+              </w:rPr>
+            </w:pPr>
+            <w:r>
+              <w:rPr>
+                <w:rFonts w:ascii="Arial" w:hAnsi="Arial" w:cs="Arial"/>
+              </w:rPr>
+              <w:t>Bei dieser Gutschrift handelt es sich um eine kaufmännische Gutschrift</w:t>
+            </w:r>
+            <w:r>
+              <w:rPr>
+                <w:rFonts w:ascii="Arial" w:hAnsi="Arial" w:cs="Arial"/>
+              </w:rPr>
+              <w:t xml:space="preserve"> </w:t>
+            </w:r>
+            <w:r>
+              <w:rPr>
+                <w:rFonts w:ascii="Arial" w:hAnsi="Arial" w:cs="Arial"/>
+              </w:rPr>
+              <w:t>(Preisnachlass/Rechnungskorrektur), nicht um eine umsatzsteuerliche Gutschrift im Sinne von § 14 Abs. 2 Satz 2 UStG.</w:t>
+            </w:r>
+          </w:p>
         </w:tc>
       </w:tr>
       <w:tr>
@@ -1481,20 +1495,6 @@
           <w:tcPr>
             <w:tcW w:w="9062" w:type="dxa"/>
           </w:tcPr>
-          <w:p>
-            <w:pPr>
-              <w:rPr>
-                <w:rFonts w:ascii="Arial" w:hAnsi="Arial" w:cs="Arial"/>
-              </w:rPr>
-            </w:pPr>
-          </w:p>
-          <w:p>
-            <w:pPr>
-              <w:rPr>
-                <w:rFonts w:ascii="Arial" w:hAnsi="Arial" w:cs="Arial"/>
-              </w:rPr>
-            </w:pPr>
-          </w:p>
           <w:p>
             <w:pPr>
               <w:rPr>
@@ -2051,27 +2051,7 @@
               <w:sz w:val="16"/>
               <w:szCs w:val="16"/>
             </w:rPr>
-            <w:t xml:space="preserve"> USt-</w:t>
-          </w:r>
-          <w:proofErr w:type="spellStart"/>
-          <w:r>
-            <w:rPr>
-              <w:rFonts w:ascii="Arial" w:hAnsi="Arial" w:cs="Arial"/>
-              <w:color w:val="808080" w:themeColor="background1" w:themeShade="80"/>
-              <w:sz w:val="16"/>
-              <w:szCs w:val="16"/>
-            </w:rPr>
-            <w:t>IdNr</w:t>
-          </w:r>
-          <w:proofErr w:type="spellEnd"/>
-          <w:r>
-            <w:rPr>
-              <w:rFonts w:ascii="Arial" w:hAnsi="Arial" w:cs="Arial"/>
-              <w:color w:val="808080" w:themeColor="background1" w:themeShade="80"/>
-              <w:sz w:val="16"/>
-              <w:szCs w:val="16"/>
-            </w:rPr>
-            <w:t xml:space="preserve">. </w:t>
+            <w:t xml:space="preserve"> USt-IdNr. </w:t>
           </w:r>
           <w:r>
             <w:rPr>
@@ -2154,6 +2134,7 @@
         <w:dataBinding w:prefixMappings="xmlns:ns0='http://schemas.openxmlformats.org/package/2006/metadata/core-properties' xmlns:ns1='http://purl.org/dc/elements/1.1/'" w:xpath="/ns0:coreProperties[1]/ns1:title[1]" w:storeItemID="{6C3C8BC8-F283-45AE-878A-BAB7291924A1}"/>
         <w:text/>
       </w:sdtPr>
+      <w:sdtEndPr/>
       <w:sdtContent>
         <w:r>
           <w:rPr>
@@ -2732,7 +2713,6 @@
   <w:style w:type="character" w:default="1" w:styleId="Absatz-Standardschriftart">
     <w:name w:val="Default Paragraph Font"/>
     <w:uiPriority w:val="1"/>
-    <w:semiHidden/>
     <w:unhideWhenUsed/>
   </w:style>
   <w:style w:type="table" w:default="1" w:styleId="NormaleTabelle">
@@ -2998,6 +2978,8 @@
     <w:rsid w:val="004E6C19"/>
     <w:rsid w:val="005015B3"/>
     <w:rsid w:val="00710595"/>
+    <w:rsid w:val="00811DB5"/>
+    <w:rsid w:val="008462AD"/>
     <w:rsid w:val="00992427"/>
     <w:rsid w:val="009C2152"/>
     <w:rsid w:val="00A05CA2"/>
@@ -3457,14 +3439,6 @@
     <w:semiHidden/>
     <w:unhideWhenUsed/>
   </w:style>
-  <w:style w:type="paragraph" w:customStyle="1" w:styleId="E1D331011CB946D280C8D835C6ECC812">
-    <w:name w:val="E1D331011CB946D280C8D835C6ECC812"/>
-    <w:rsid w:val="00B17F53"/>
-  </w:style>
-  <w:style w:type="paragraph" w:customStyle="1" w:styleId="24FA493A6DD749508075BAFFBB92E413">
-    <w:name w:val="24FA493A6DD749508075BAFFBB92E413"/>
-    <w:rsid w:val="00BD0514"/>
-  </w:style>
   <w:style w:type="paragraph" w:customStyle="1" w:styleId="069C065AE674434BA7F1B66AB9450570">
     <w:name w:val="069C065AE674434BA7F1B66AB9450570"/>
     <w:rsid w:val="00BD0514"/>

</xml_diff>